<commit_message>
docs: add Tech Stack section to demo script
</commit_message>
<xml_diff>
--- a/Incident_Response_Agent_Demo_Script.docx
+++ b/Incident_Response_Agent_Demo_Script.docx
@@ -643,6 +643,349 @@
           <w:szCs w:val="20"/>
         </w:rPr>
         <w:t xml:space="preserve">Note: Jira tickets, logs, and incident data are mocked for demo purposes. Integration layer is built and ready for real credentials.</w:t>
+      </w:r>
+    </w:p>
+    <w:p>
+      <w:pPr>
+        <w:pBdr>
+          <w:bottom w:val="single" w:color="000000" w:sz="6"/>
+        </w:pBdr>
+        <w:spacing w:after="120" w:before="280"/>
+      </w:pPr>
+      <w:r>
+        <w:rPr>
+          <w:rFonts w:ascii="Arial" w:cs="Arial" w:eastAsia="Arial" w:hAnsi="Arial"/>
+          <w:b/>
+          <w:bCs/>
+          <w:sz w:val="28"/>
+          <w:szCs w:val="28"/>
+        </w:rPr>
+        <w:t xml:space="preserve">Tech Stack</w:t>
+      </w:r>
+    </w:p>
+    <w:p>
+      <w:pPr>
+        <w:spacing w:after="60" w:before="60"/>
+      </w:pPr>
+      <w:r>
+        <w:rPr>
+          <w:rFonts w:ascii="Arial" w:cs="Arial" w:eastAsia="Arial" w:hAnsi="Arial"/>
+          <w:b/>
+          <w:bCs/>
+          <w:sz w:val="20"/>
+          <w:szCs w:val="20"/>
+        </w:rPr>
+        <w:t xml:space="preserve">What I Was Assigned</w:t>
+      </w:r>
+    </w:p>
+    <w:p>
+      <w:pPr>
+        <w:spacing w:after="60" w:before="60"/>
+      </w:pPr>
+      <w:r>
+        <w:rPr>
+          <w:rFonts w:ascii="Arial" w:cs="Arial" w:eastAsia="Arial" w:hAnsi="Arial"/>
+          <w:sz w:val="20"/>
+          <w:szCs w:val="20"/>
+        </w:rPr>
+        <w:t xml:space="preserve">Build an AI-powered incident response agent system using LangGraph multi-agent orchestration, FastAPI, and the AG-UI protocol — integrating LLM reasoning, persistent memory, human-in-the-loop approval, and real-time streaming into a working end-to-end workflow.</w:t>
+      </w:r>
+    </w:p>
+    <w:p>
+      <w:pPr>
+        <w:spacing w:after="40" w:before="120"/>
+      </w:pPr>
+      <w:r>
+        <w:rPr>
+          <w:rFonts w:ascii="Arial" w:cs="Arial" w:eastAsia="Arial" w:hAnsi="Arial"/>
+          <w:b/>
+          <w:bCs/>
+          <w:sz w:val="20"/>
+          <w:szCs w:val="20"/>
+        </w:rPr>
+        <w:t xml:space="preserve">Backend</w:t>
+      </w:r>
+    </w:p>
+    <w:p>
+      <w:pPr>
+        <w:pStyle w:val="ListParagraph"/>
+        <w:numPr>
+          <w:ilvl w:val="0"/>
+          <w:numId w:val="2"/>
+        </w:numPr>
+        <w:spacing w:after="40" w:before="40"/>
+      </w:pPr>
+      <w:r>
+        <w:rPr>
+          <w:rFonts w:ascii="Arial" w:cs="Arial" w:eastAsia="Arial" w:hAnsi="Arial"/>
+          <w:sz w:val="20"/>
+          <w:szCs w:val="20"/>
+        </w:rPr>
+        <w:t xml:space="preserve">Python / FastAPI — REST API + SSE streaming</w:t>
+      </w:r>
+    </w:p>
+    <w:p>
+      <w:pPr>
+        <w:pStyle w:val="ListParagraph"/>
+        <w:numPr>
+          <w:ilvl w:val="0"/>
+          <w:numId w:val="2"/>
+        </w:numPr>
+        <w:spacing w:after="40" w:before="40"/>
+      </w:pPr>
+      <w:r>
+        <w:rPr>
+          <w:rFonts w:ascii="Arial" w:cs="Arial" w:eastAsia="Arial" w:hAnsi="Arial"/>
+          <w:sz w:val="20"/>
+          <w:szCs w:val="20"/>
+        </w:rPr>
+        <w:t xml:space="preserve">LangGraph — multi-agent stateful workflow with HITL interrupt</w:t>
+      </w:r>
+    </w:p>
+    <w:p>
+      <w:pPr>
+        <w:pStyle w:val="ListParagraph"/>
+        <w:numPr>
+          <w:ilvl w:val="0"/>
+          <w:numId w:val="2"/>
+        </w:numPr>
+        <w:spacing w:after="40" w:before="40"/>
+      </w:pPr>
+      <w:r>
+        <w:rPr>
+          <w:rFonts w:ascii="Arial" w:cs="Arial" w:eastAsia="Arial" w:hAnsi="Arial"/>
+          <w:sz w:val="20"/>
+          <w:szCs w:val="20"/>
+        </w:rPr>
+        <w:t xml:space="preserve">LangChain (langchain-google-genai) — LLM integration (Gemini 2.5 Flash)</w:t>
+      </w:r>
+    </w:p>
+    <w:p>
+      <w:pPr>
+        <w:pStyle w:val="ListParagraph"/>
+        <w:numPr>
+          <w:ilvl w:val="0"/>
+          <w:numId w:val="2"/>
+        </w:numPr>
+        <w:spacing w:after="40" w:before="40"/>
+      </w:pPr>
+      <w:r>
+        <w:rPr>
+          <w:rFonts w:ascii="Arial" w:cs="Arial" w:eastAsia="Arial" w:hAnsi="Arial"/>
+          <w:sz w:val="20"/>
+          <w:szCs w:val="20"/>
+        </w:rPr>
+        <w:t xml:space="preserve">Mem0 — persistent incident memory across runs</w:t>
+      </w:r>
+    </w:p>
+    <w:p>
+      <w:pPr>
+        <w:pStyle w:val="ListParagraph"/>
+        <w:numPr>
+          <w:ilvl w:val="0"/>
+          <w:numId w:val="2"/>
+        </w:numPr>
+        <w:spacing w:after="40" w:before="40"/>
+      </w:pPr>
+      <w:r>
+        <w:rPr>
+          <w:rFonts w:ascii="Arial" w:cs="Arial" w:eastAsia="Arial" w:hAnsi="Arial"/>
+          <w:sz w:val="20"/>
+          <w:szCs w:val="20"/>
+        </w:rPr>
+        <w:t xml:space="preserve">Langfuse — LLM observability and tracing</w:t>
+      </w:r>
+    </w:p>
+    <w:p>
+      <w:pPr>
+        <w:pStyle w:val="ListParagraph"/>
+        <w:numPr>
+          <w:ilvl w:val="0"/>
+          <w:numId w:val="2"/>
+        </w:numPr>
+        <w:spacing w:after="40" w:before="40"/>
+      </w:pPr>
+      <w:r>
+        <w:rPr>
+          <w:rFonts w:ascii="Arial" w:cs="Arial" w:eastAsia="Arial" w:hAnsi="Arial"/>
+          <w:sz w:val="20"/>
+          <w:szCs w:val="20"/>
+        </w:rPr>
+        <w:t xml:space="preserve">MCP (Model Context Protocol) — tool integration (Jira, SMTP, log tools)</w:t>
+      </w:r>
+    </w:p>
+    <w:p>
+      <w:pPr>
+        <w:pStyle w:val="ListParagraph"/>
+        <w:numPr>
+          <w:ilvl w:val="0"/>
+          <w:numId w:val="2"/>
+        </w:numPr>
+        <w:spacing w:after="40" w:before="40"/>
+      </w:pPr>
+      <w:r>
+        <w:rPr>
+          <w:rFonts w:ascii="Arial" w:cs="Arial" w:eastAsia="Arial" w:hAnsi="Arial"/>
+          <w:sz w:val="20"/>
+          <w:szCs w:val="20"/>
+        </w:rPr>
+        <w:t xml:space="preserve">SQLite — audit log / run history</w:t>
+      </w:r>
+    </w:p>
+    <w:p>
+      <w:pPr>
+        <w:pStyle w:val="ListParagraph"/>
+        <w:numPr>
+          <w:ilvl w:val="0"/>
+          <w:numId w:val="2"/>
+        </w:numPr>
+        <w:spacing w:after="40" w:before="40"/>
+      </w:pPr>
+      <w:r>
+        <w:rPr>
+          <w:rFonts w:ascii="Arial" w:cs="Arial" w:eastAsia="Arial" w:hAnsi="Arial"/>
+          <w:sz w:val="20"/>
+          <w:szCs w:val="20"/>
+        </w:rPr>
+        <w:t xml:space="preserve">slowapi — rate limiting</w:t>
+      </w:r>
+    </w:p>
+    <w:p>
+      <w:pPr>
+        <w:spacing w:after="40" w:before="120"/>
+      </w:pPr>
+      <w:r>
+        <w:rPr>
+          <w:rFonts w:ascii="Arial" w:cs="Arial" w:eastAsia="Arial" w:hAnsi="Arial"/>
+          <w:b/>
+          <w:bCs/>
+          <w:sz w:val="20"/>
+          <w:szCs w:val="20"/>
+        </w:rPr>
+        <w:t xml:space="preserve">Frontend</w:t>
+      </w:r>
+    </w:p>
+    <w:p>
+      <w:pPr>
+        <w:pStyle w:val="ListParagraph"/>
+        <w:numPr>
+          <w:ilvl w:val="0"/>
+          <w:numId w:val="2"/>
+        </w:numPr>
+        <w:spacing w:after="40" w:before="40"/>
+      </w:pPr>
+      <w:r>
+        <w:rPr>
+          <w:rFonts w:ascii="Arial" w:cs="Arial" w:eastAsia="Arial" w:hAnsi="Arial"/>
+          <w:sz w:val="20"/>
+          <w:szCs w:val="20"/>
+        </w:rPr>
+        <w:t xml:space="preserve">React 19 + TypeScript — component-based UI</w:t>
+      </w:r>
+    </w:p>
+    <w:p>
+      <w:pPr>
+        <w:pStyle w:val="ListParagraph"/>
+        <w:numPr>
+          <w:ilvl w:val="0"/>
+          <w:numId w:val="2"/>
+        </w:numPr>
+        <w:spacing w:after="40" w:before="40"/>
+      </w:pPr>
+      <w:r>
+        <w:rPr>
+          <w:rFonts w:ascii="Arial" w:cs="Arial" w:eastAsia="Arial" w:hAnsi="Arial"/>
+          <w:sz w:val="20"/>
+          <w:szCs w:val="20"/>
+        </w:rPr>
+        <w:t xml:space="preserve">Vite — dev server and build tool</w:t>
+      </w:r>
+    </w:p>
+    <w:p>
+      <w:pPr>
+        <w:pStyle w:val="ListParagraph"/>
+        <w:numPr>
+          <w:ilvl w:val="0"/>
+          <w:numId w:val="2"/>
+        </w:numPr>
+        <w:spacing w:after="40" w:before="40"/>
+      </w:pPr>
+      <w:r>
+        <w:rPr>
+          <w:rFonts w:ascii="Arial" w:cs="Arial" w:eastAsia="Arial" w:hAnsi="Arial"/>
+          <w:sz w:val="20"/>
+          <w:szCs w:val="20"/>
+        </w:rPr>
+        <w:t xml:space="preserve">AG-UI / SSE — real-time event streaming from backend to browser</w:t>
+      </w:r>
+    </w:p>
+    <w:p>
+      <w:pPr>
+        <w:pStyle w:val="ListParagraph"/>
+        <w:numPr>
+          <w:ilvl w:val="0"/>
+          <w:numId w:val="2"/>
+        </w:numPr>
+        <w:spacing w:after="40" w:before="40"/>
+      </w:pPr>
+      <w:r>
+        <w:rPr>
+          <w:rFonts w:ascii="Arial" w:cs="Arial" w:eastAsia="Arial" w:hAnsi="Arial"/>
+          <w:sz w:val="20"/>
+          <w:szCs w:val="20"/>
+        </w:rPr>
+        <w:t xml:space="preserve">Axios — HTTP client</w:t>
+      </w:r>
+    </w:p>
+    <w:p>
+      <w:pPr>
+        <w:spacing w:after="40" w:before="120"/>
+      </w:pPr>
+      <w:r>
+        <w:rPr>
+          <w:rFonts w:ascii="Arial" w:cs="Arial" w:eastAsia="Arial" w:hAnsi="Arial"/>
+          <w:b/>
+          <w:bCs/>
+          <w:sz w:val="20"/>
+          <w:szCs w:val="20"/>
+        </w:rPr>
+        <w:t xml:space="preserve">Infrastructure</w:t>
+      </w:r>
+    </w:p>
+    <w:p>
+      <w:pPr>
+        <w:pStyle w:val="ListParagraph"/>
+        <w:numPr>
+          <w:ilvl w:val="0"/>
+          <w:numId w:val="2"/>
+        </w:numPr>
+        <w:spacing w:after="40" w:before="40"/>
+      </w:pPr>
+      <w:r>
+        <w:rPr>
+          <w:rFonts w:ascii="Arial" w:cs="Arial" w:eastAsia="Arial" w:hAnsi="Arial"/>
+          <w:sz w:val="20"/>
+          <w:szCs w:val="20"/>
+        </w:rPr>
+        <w:t xml:space="preserve">Docker Compose — local Langfuse + Postgres observability stack</w:t>
+      </w:r>
+    </w:p>
+    <w:p>
+      <w:pPr>
+        <w:pStyle w:val="ListParagraph"/>
+        <w:numPr>
+          <w:ilvl w:val="0"/>
+          <w:numId w:val="2"/>
+        </w:numPr>
+        <w:spacing w:after="80" w:before="40"/>
+      </w:pPr>
+      <w:r>
+        <w:rPr>
+          <w:rFonts w:ascii="Arial" w:cs="Arial" w:eastAsia="Arial" w:hAnsi="Arial"/>
+          <w:sz w:val="20"/>
+          <w:szCs w:val="20"/>
+        </w:rPr>
+        <w:t xml:space="preserve">uvicorn — ASGI server for FastAPI</w:t>
       </w:r>
     </w:p>
     <w:p>

</xml_diff>